<commit_message>
record successful live PostgreSQL verification
</commit_message>
<xml_diff>
--- a/tests-artifacts/project_report.docx
+++ b/tests-artifacts/project_report.docx
@@ -4,46 +4,209 @@
   <w:body>
     <w:p>
       <w:pPr>
-        <w:pStyle w:val="Title"/>
+        <w:pStyle w:val="Heading1"/>
       </w:pPr>
       <w:r>
-        <w:t>Random Letter Generator — Project Summary</w:t>
+        <w:t>Random Letter Generator — Live Verification</w:t>
       </w:r>
     </w:p>
     <w:p>
       <w:r>
-        <w:t>FastAPI 0.115.6 service using an asyncpg pool and raw PostgreSQL SQL.</w:t>
+        <w:t>Live verification used PostgreSQL at the configured localhost:5432 DATABASE_URL.</w:t>
       </w:r>
     </w:p>
     <w:p>
       <w:pPr>
-        <w:pStyle w:val="Heading1"/>
+        <w:pStyle w:val="Heading2"/>
       </w:pPr>
       <w:r>
-        <w:t>Implemented API</w:t>
+        <w:t>Observed endpoint results</w:t>
       </w:r>
     </w:p>
+    <w:tbl>
+      <w:tblPr>
+        <w:tblStyle w:val="TableGrid"/>
+        <w:tblW w:type="auto" w:w="0"/>
+        <w:tblLook w:firstColumn="1" w:firstRow="1" w:lastColumn="0" w:lastRow="0" w:noHBand="0" w:noVBand="1" w:val="04A0"/>
+      </w:tblPr>
+      <w:tblGrid>
+        <w:gridCol w:w="2160"/>
+        <w:gridCol w:w="2160"/>
+        <w:gridCol w:w="2160"/>
+        <w:gridCol w:w="2160"/>
+      </w:tblGrid>
+      <w:tr>
+        <w:tc>
+          <w:tcPr>
+            <w:tcW w:type="dxa" w:w="2160"/>
+          </w:tcPr>
+          <w:p>
+            <w:r>
+              <w:t>Method</w:t>
+            </w:r>
+          </w:p>
+        </w:tc>
+        <w:tc>
+          <w:tcPr>
+            <w:tcW w:type="dxa" w:w="2160"/>
+          </w:tcPr>
+          <w:p>
+            <w:r>
+              <w:t>Endpoint</w:t>
+            </w:r>
+          </w:p>
+        </w:tc>
+        <w:tc>
+          <w:tcPr>
+            <w:tcW w:type="dxa" w:w="2160"/>
+          </w:tcPr>
+          <w:p>
+            <w:r>
+              <w:t>Status</w:t>
+            </w:r>
+          </w:p>
+        </w:tc>
+        <w:tc>
+          <w:tcPr>
+            <w:tcW w:type="dxa" w:w="2160"/>
+          </w:tcPr>
+          <w:p>
+            <w:r>
+              <w:t>Result</w:t>
+            </w:r>
+          </w:p>
+        </w:tc>
+      </w:tr>
+      <w:tr>
+        <w:tc>
+          <w:tcPr>
+            <w:tcW w:type="dxa" w:w="2160"/>
+          </w:tcPr>
+          <w:p>
+            <w:r>
+              <w:t>POST</w:t>
+            </w:r>
+          </w:p>
+        </w:tc>
+        <w:tc>
+          <w:tcPr>
+            <w:tcW w:type="dxa" w:w="2160"/>
+          </w:tcPr>
+          <w:p>
+            <w:r>
+              <w:t>/letters/generate</w:t>
+            </w:r>
+          </w:p>
+        </w:tc>
+        <w:tc>
+          <w:tcPr>
+            <w:tcW w:type="dxa" w:w="2160"/>
+          </w:tcPr>
+          <w:p>
+            <w:r>
+              <w:t>201</w:t>
+            </w:r>
+          </w:p>
+        </w:tc>
+        <w:tc>
+          <w:tcPr>
+            <w:tcW w:type="dxa" w:w="2160"/>
+          </w:tcPr>
+          <w:p>
+            <w:r>
+              <w:t>PASS</w:t>
+            </w:r>
+          </w:p>
+        </w:tc>
+      </w:tr>
+      <w:tr>
+        <w:tc>
+          <w:tcPr>
+            <w:tcW w:type="dxa" w:w="2160"/>
+          </w:tcPr>
+          <w:p>
+            <w:r>
+              <w:t>GET</w:t>
+            </w:r>
+          </w:p>
+        </w:tc>
+        <w:tc>
+          <w:tcPr>
+            <w:tcW w:type="dxa" w:w="2160"/>
+          </w:tcPr>
+          <w:p>
+            <w:r>
+              <w:t>/letters</w:t>
+            </w:r>
+          </w:p>
+        </w:tc>
+        <w:tc>
+          <w:tcPr>
+            <w:tcW w:type="dxa" w:w="2160"/>
+          </w:tcPr>
+          <w:p>
+            <w:r>
+              <w:t>200</w:t>
+            </w:r>
+          </w:p>
+        </w:tc>
+        <w:tc>
+          <w:tcPr>
+            <w:tcW w:type="dxa" w:w="2160"/>
+          </w:tcPr>
+          <w:p>
+            <w:r>
+              <w:t>PASS</w:t>
+            </w:r>
+          </w:p>
+        </w:tc>
+      </w:tr>
+      <w:tr>
+        <w:tc>
+          <w:tcPr>
+            <w:tcW w:type="dxa" w:w="2160"/>
+          </w:tcPr>
+          <w:p>
+            <w:r>
+              <w:t>GET</w:t>
+            </w:r>
+          </w:p>
+        </w:tc>
+        <w:tc>
+          <w:tcPr>
+            <w:tcW w:type="dxa" w:w="2160"/>
+          </w:tcPr>
+          <w:p>
+            <w:r>
+              <w:t>/letters/999999</w:t>
+            </w:r>
+          </w:p>
+        </w:tc>
+        <w:tc>
+          <w:tcPr>
+            <w:tcW w:type="dxa" w:w="2160"/>
+          </w:tcPr>
+          <w:p>
+            <w:r>
+              <w:t>404</w:t>
+            </w:r>
+          </w:p>
+        </w:tc>
+        <w:tc>
+          <w:tcPr>
+            <w:tcW w:type="dxa" w:w="2160"/>
+          </w:tcPr>
+          <w:p>
+            <w:r>
+              <w:t>PASS</w:t>
+            </w:r>
+          </w:p>
+        </w:tc>
+      </w:tr>
+    </w:tbl>
     <w:p>
       <w:r>
-        <w:t>POST /letters/generate; GET /letters; GET /letters/{letter_id}.</w:t>
-      </w:r>
-    </w:p>
-    <w:p>
-      <w:pPr>
-        <w:pStyle w:val="Heading1"/>
-      </w:pPr>
-      <w:r>
-        <w:t>Verification</w:t>
-      </w:r>
-    </w:p>
-    <w:p>
-      <w:r>
-        <w:t>Dependency installation, import, and bytecode compilation passed.</w:t>
-      </w:r>
-    </w:p>
-    <w:p>
-      <w:r>
-        <w:t>Live API verification was attempted three times but could not start because PostgreSQL was unavailable at the configured localhost:5432 endpoint. The workbook contains the actual refused-connection probes and is intentionally marked FAIL rather than predicted results.</w:t>
+        <w:t>All rows are recorded from HTTP responses received by this report run.</w:t>
       </w:r>
     </w:p>
     <w:sectPr>

</xml_diff>